<commit_message>
Fix corrupted document generation by switching to CommonJS
Replaces the ESM script with a CommonJS equivalent for generating DOCX files, resolving module interop issues that caused corrupted output.

Replit-Commit-Author: Agent
Replit-Commit-Session-Id: 7ab173fc-c0ae-4549-a6f7-9960ef73686b
Replit-Commit-Checkpoint-Type: full_checkpoint
Replit-Commit-Event-Id: decc8480-5e35-4d2a-822a-2a093e094099
Replit-Commit-Screenshot-Url: https://storage.googleapis.com/screenshot-production-us-central1/84522d90-6d69-42c9-90f8-a2adebddaff2/7ab173fc-c0ae-4549-a6f7-9960ef73686b/0UGbwhI
Replit-Helium-Checkpoint-Created: true
</commit_message>
<xml_diff>
--- a/lib/db/trade-secret-EN.docx
+++ b/lib/db/trade-secret-EN.docx
@@ -4,7 +4,7 @@
   <w:body>
     <w:p>
       <w:pPr>
-        <w:spacing w:after="80" w:before="200"/>
+        <w:spacing w:after="60" w:before="60"/>
         <w:jc w:val="center"/>
       </w:pPr>
       <w:r>
@@ -21,7 +21,7 @@
     </w:p>
     <w:p>
       <w:pPr>
-        <w:spacing w:after="80"/>
+        <w:spacing w:after="60" w:before="60"/>
         <w:jc w:val="center"/>
       </w:pPr>
       <w:r>
@@ -38,7 +38,7 @@
     </w:p>
     <w:p>
       <w:pPr>
-        <w:spacing w:after="240"/>
+        <w:spacing w:after="60" w:before="60"/>
         <w:jc w:val="center"/>
       </w:pPr>
       <w:r>
@@ -53,16 +53,21 @@
     </w:p>
     <w:p>
       <w:pPr>
+        <w:spacing w:before="120"/>
+      </w:pPr>
+    </w:p>
+    <w:p>
+      <w:pPr>
         <w:pBdr>
           <w:bottom w:val="single" w:color="D97706" w:sz="6"/>
         </w:pBdr>
-        <w:spacing w:after="120" w:before="120"/>
+        <w:spacing w:after="160" w:before="160"/>
       </w:pPr>
     </w:p>
     <w:p>
       <w:pPr>
         <w:pStyle w:val="Heading1"/>
-        <w:spacing w:after="120" w:before="240"/>
+        <w:spacing w:after="100" w:before="280"/>
       </w:pPr>
       <w:r>
         <w:t xml:space="preserve">1. Purpose of This Document</w:t>
@@ -79,13 +84,13 @@
           <w:sz w:val="22"/>
           <w:szCs w:val="22"/>
         </w:rPr>
-        <w:t xml:space="preserve">This document establishes the formal trade secret classification of the Resilium resilience methodology and all associated intellectual property. It is intended to create a written record of proprietary ownership for internal use, legal protection, and enforcement purposes in accordance with the Romanian Law no. 11/1991 on unfair competition, the EU Trade Secrets Directive (2016/943/EU), and the US Defend Trade Secrets Act (DTSA).</w:t>
+        <w:t xml:space="preserve">This document establishes the formal trade secret classification of the Resilium resilience methodology and all associated intellectual property. It is intended to create a written record of proprietary ownership for internal use, legal protection, and enforcement purposes in accordance with Romanian Law no. 11/1991 on unfair competition, the EU Trade Secrets Directive (2016/943/EU), and the US Defend Trade Secrets Act (DTSA).</w:t>
       </w:r>
     </w:p>
     <w:p>
       <w:pPr>
         <w:pStyle w:val="Heading1"/>
-        <w:spacing w:after="120" w:before="240"/>
+        <w:spacing w:after="100" w:before="280"/>
       </w:pPr>
       <w:r>
         <w:t xml:space="preserve">2. Owner &amp; Operator</w:t>
@@ -122,7 +127,7 @@
     <w:p>
       <w:pPr>
         <w:pStyle w:val="Heading1"/>
-        <w:spacing w:after="120" w:before="240"/>
+        <w:spacing w:after="100" w:before="280"/>
       </w:pPr>
       <w:r>
         <w:t xml:space="preserve">3. Classification of Proprietary Assets</w:t>
@@ -145,299 +150,299 @@
     <w:p>
       <w:pPr>
         <w:pStyle w:val="Heading2"/>
-        <w:spacing w:after="120" w:before="240"/>
-      </w:pPr>
-      <w:r>
-        <w:t xml:space="preserve">3.1 Resilience Scoring Algorithm</w:t>
-      </w:r>
-    </w:p>
-    <w:p>
-      <w:pPr>
-        <w:spacing w:after="60" w:before="60"/>
-        <w:ind w:left="360"/>
-      </w:pPr>
-      <w:r>
-        <w:rPr>
-          <w:rFonts w:ascii="Calibri" w:cs="Calibri" w:eastAsia="Calibri" w:hAnsi="Calibri"/>
-          <w:sz w:val="22"/>
-          <w:szCs w:val="22"/>
-        </w:rPr>
-        <w:t xml:space="preserve">• The multi-dimensional scoring methodology that produces a weighted composite resilience score across six life dimensions: Financial, Health, Skills, Mobility, Psychological, and Resources.</w:t>
-      </w:r>
-    </w:p>
-    <w:p>
-      <w:pPr>
-        <w:spacing w:after="60" w:before="60"/>
-        <w:ind w:left="360"/>
-      </w:pPr>
-      <w:r>
-        <w:rPr>
-          <w:rFonts w:ascii="Calibri" w:cs="Calibri" w:eastAsia="Calibri" w:hAnsi="Calibri"/>
-          <w:sz w:val="22"/>
-          <w:szCs w:val="22"/>
-        </w:rPr>
-        <w:t xml:space="preserve">• The specific weighting matrix applied to each dimension based on household composition, location, income stability, and stated risk priorities.</w:t>
-      </w:r>
-    </w:p>
-    <w:p>
-      <w:pPr>
-        <w:spacing w:after="60" w:before="60"/>
-        <w:ind w:left="360"/>
-      </w:pPr>
-      <w:r>
-        <w:rPr>
-          <w:rFonts w:ascii="Calibri" w:cs="Calibri" w:eastAsia="Calibri" w:hAnsi="Calibri"/>
-          <w:sz w:val="22"/>
-          <w:szCs w:val="22"/>
-        </w:rPr>
-        <w:t xml:space="preserve">• The normalization and benchmarking logic that positions individual scores within population distributions.</w:t>
-      </w:r>
-    </w:p>
-    <w:p>
-      <w:pPr>
-        <w:spacing w:after="60" w:before="60"/>
-        <w:ind w:left="360"/>
-      </w:pPr>
-      <w:r>
-        <w:rPr>
-          <w:rFonts w:ascii="Calibri" w:cs="Calibri" w:eastAsia="Calibri" w:hAnsi="Calibri"/>
-          <w:sz w:val="22"/>
-          <w:szCs w:val="22"/>
-        </w:rPr>
-        <w:t xml:space="preserve">• The Social Capital overlay dimension and its integration into the composite score.</w:t>
+        <w:spacing w:after="100" w:before="280"/>
+      </w:pPr>
+      <w:r>
+        <w:t xml:space="preserve">3.1  Resilience Scoring Algorithm</w:t>
+      </w:r>
+    </w:p>
+    <w:p>
+      <w:pPr>
+        <w:spacing w:after="60" w:before="60"/>
+        <w:ind w:left="400"/>
+      </w:pPr>
+      <w:r>
+        <w:rPr>
+          <w:rFonts w:ascii="Calibri" w:cs="Calibri" w:eastAsia="Calibri" w:hAnsi="Calibri"/>
+          <w:sz w:val="22"/>
+          <w:szCs w:val="22"/>
+        </w:rPr>
+        <w:t xml:space="preserve">•  The multi-dimensional scoring methodology producing a weighted composite resilience score across six life dimensions: Financial, Health, Skills, Mobility, Psychological, and Resources.</w:t>
+      </w:r>
+    </w:p>
+    <w:p>
+      <w:pPr>
+        <w:spacing w:after="60" w:before="60"/>
+        <w:ind w:left="400"/>
+      </w:pPr>
+      <w:r>
+        <w:rPr>
+          <w:rFonts w:ascii="Calibri" w:cs="Calibri" w:eastAsia="Calibri" w:hAnsi="Calibri"/>
+          <w:sz w:val="22"/>
+          <w:szCs w:val="22"/>
+        </w:rPr>
+        <w:t xml:space="preserve">•  The specific weighting matrix applied to each dimension based on household composition, location, income stability, and stated risk priorities.</w:t>
+      </w:r>
+    </w:p>
+    <w:p>
+      <w:pPr>
+        <w:spacing w:after="60" w:before="60"/>
+        <w:ind w:left="400"/>
+      </w:pPr>
+      <w:r>
+        <w:rPr>
+          <w:rFonts w:ascii="Calibri" w:cs="Calibri" w:eastAsia="Calibri" w:hAnsi="Calibri"/>
+          <w:sz w:val="22"/>
+          <w:szCs w:val="22"/>
+        </w:rPr>
+        <w:t xml:space="preserve">•  The normalization and benchmarking logic that positions individual scores within population distributions.</w:t>
+      </w:r>
+    </w:p>
+    <w:p>
+      <w:pPr>
+        <w:spacing w:after="60" w:before="60"/>
+        <w:ind w:left="400"/>
+      </w:pPr>
+      <w:r>
+        <w:rPr>
+          <w:rFonts w:ascii="Calibri" w:cs="Calibri" w:eastAsia="Calibri" w:hAnsi="Calibri"/>
+          <w:sz w:val="22"/>
+          <w:szCs w:val="22"/>
+        </w:rPr>
+        <w:t xml:space="preserve">•  The Social Capital overlay dimension and its integration into the composite score.</w:t>
       </w:r>
     </w:p>
     <w:p>
       <w:pPr>
         <w:pStyle w:val="Heading2"/>
-        <w:spacing w:after="120" w:before="240"/>
-      </w:pPr>
-      <w:r>
-        <w:t xml:space="preserve">3.2 Six-Dimension Assessment Framework</w:t>
-      </w:r>
-    </w:p>
-    <w:p>
-      <w:pPr>
-        <w:spacing w:after="60" w:before="60"/>
-        <w:ind w:left="360"/>
-      </w:pPr>
-      <w:r>
-        <w:rPr>
-          <w:rFonts w:ascii="Calibri" w:cs="Calibri" w:eastAsia="Calibri" w:hAnsi="Calibri"/>
-          <w:sz w:val="22"/>
-          <w:szCs w:val="22"/>
-        </w:rPr>
-        <w:t xml:space="preserve">• The specific question sequence, branching logic, and adaptive follow-up questions within the full resilience assessment (13+ step flow).</w:t>
-      </w:r>
-    </w:p>
-    <w:p>
-      <w:pPr>
-        <w:spacing w:after="60" w:before="60"/>
-        <w:ind w:left="360"/>
-      </w:pPr>
-      <w:r>
-        <w:rPr>
-          <w:rFonts w:ascii="Calibri" w:cs="Calibri" w:eastAsia="Calibri" w:hAnsi="Calibri"/>
-          <w:sz w:val="22"/>
-          <w:szCs w:val="22"/>
-        </w:rPr>
-        <w:t xml:space="preserve">• The Mental Resilience sub-assessment (MR questionnaire) and its integration with the six primary dimensions.</w:t>
-      </w:r>
-    </w:p>
-    <w:p>
-      <w:pPr>
-        <w:spacing w:after="60" w:before="60"/>
-        <w:ind w:left="360"/>
-      </w:pPr>
-      <w:r>
-        <w:rPr>
-          <w:rFonts w:ascii="Calibri" w:cs="Calibri" w:eastAsia="Calibri" w:hAnsi="Calibri"/>
-          <w:sz w:val="22"/>
-          <w:szCs w:val="22"/>
-        </w:rPr>
-        <w:t xml:space="preserve">• The mapping of assessment responses to vulnerability categories and priority tiers.</w:t>
+        <w:spacing w:after="100" w:before="280"/>
+      </w:pPr>
+      <w:r>
+        <w:t xml:space="preserve">3.2  Six-Dimension Assessment Framework</w:t>
+      </w:r>
+    </w:p>
+    <w:p>
+      <w:pPr>
+        <w:spacing w:after="60" w:before="60"/>
+        <w:ind w:left="400"/>
+      </w:pPr>
+      <w:r>
+        <w:rPr>
+          <w:rFonts w:ascii="Calibri" w:cs="Calibri" w:eastAsia="Calibri" w:hAnsi="Calibri"/>
+          <w:sz w:val="22"/>
+          <w:szCs w:val="22"/>
+        </w:rPr>
+        <w:t xml:space="preserve">•  The specific question sequence, branching logic, and adaptive follow-up questions within the full resilience assessment (13+ step flow).</w:t>
+      </w:r>
+    </w:p>
+    <w:p>
+      <w:pPr>
+        <w:spacing w:after="60" w:before="60"/>
+        <w:ind w:left="400"/>
+      </w:pPr>
+      <w:r>
+        <w:rPr>
+          <w:rFonts w:ascii="Calibri" w:cs="Calibri" w:eastAsia="Calibri" w:hAnsi="Calibri"/>
+          <w:sz w:val="22"/>
+          <w:szCs w:val="22"/>
+        </w:rPr>
+        <w:t xml:space="preserve">•  The Mental Resilience sub-assessment (MR questionnaire) and its integration with the six primary dimensions.</w:t>
+      </w:r>
+    </w:p>
+    <w:p>
+      <w:pPr>
+        <w:spacing w:after="60" w:before="60"/>
+        <w:ind w:left="400"/>
+      </w:pPr>
+      <w:r>
+        <w:rPr>
+          <w:rFonts w:ascii="Calibri" w:cs="Calibri" w:eastAsia="Calibri" w:hAnsi="Calibri"/>
+          <w:sz w:val="22"/>
+          <w:szCs w:val="22"/>
+        </w:rPr>
+        <w:t xml:space="preserve">•  The mapping of assessment responses to vulnerability categories and priority tiers.</w:t>
       </w:r>
     </w:p>
     <w:p>
       <w:pPr>
         <w:pStyle w:val="Heading2"/>
-        <w:spacing w:after="120" w:before="240"/>
-      </w:pPr>
-      <w:r>
-        <w:t xml:space="preserve">3.3 AI-Powered Action Plan Generation</w:t>
-      </w:r>
-    </w:p>
-    <w:p>
-      <w:pPr>
-        <w:spacing w:after="60" w:before="60"/>
-        <w:ind w:left="360"/>
-      </w:pPr>
-      <w:r>
-        <w:rPr>
-          <w:rFonts w:ascii="Calibri" w:cs="Calibri" w:eastAsia="Calibri" w:hAnsi="Calibri"/>
-          <w:sz w:val="22"/>
-          <w:szCs w:val="22"/>
-        </w:rPr>
-        <w:t xml:space="preserve">• The prompt engineering, system instruction design, and structured output schema used to generate personalized resilience action plans via large language model APIs.</w:t>
-      </w:r>
-    </w:p>
-    <w:p>
-      <w:pPr>
-        <w:spacing w:after="60" w:before="60"/>
-        <w:ind w:left="360"/>
-      </w:pPr>
-      <w:r>
-        <w:rPr>
-          <w:rFonts w:ascii="Calibri" w:cs="Calibri" w:eastAsia="Calibri" w:hAnsi="Calibri"/>
-          <w:sz w:val="22"/>
-          <w:szCs w:val="22"/>
-        </w:rPr>
-        <w:t xml:space="preserve">• The logic for translating raw scores into prioritized, area-specific, household-contextualized checklists.</w:t>
-      </w:r>
-    </w:p>
-    <w:p>
-      <w:pPr>
-        <w:spacing w:after="60" w:before="60"/>
-        <w:ind w:left="360"/>
-      </w:pPr>
-      <w:r>
-        <w:rPr>
-          <w:rFonts w:ascii="Calibri" w:cs="Calibri" w:eastAsia="Calibri" w:hAnsi="Calibri"/>
-          <w:sz w:val="22"/>
-          <w:szCs w:val="22"/>
-        </w:rPr>
-        <w:t xml:space="preserve">• The daily habits generation framework and its linkage to dimension scores and stated goals.</w:t>
+        <w:spacing w:after="100" w:before="280"/>
+      </w:pPr>
+      <w:r>
+        <w:t xml:space="preserve">3.3  AI-Powered Action Plan Generation</w:t>
+      </w:r>
+    </w:p>
+    <w:p>
+      <w:pPr>
+        <w:spacing w:after="60" w:before="60"/>
+        <w:ind w:left="400"/>
+      </w:pPr>
+      <w:r>
+        <w:rPr>
+          <w:rFonts w:ascii="Calibri" w:cs="Calibri" w:eastAsia="Calibri" w:hAnsi="Calibri"/>
+          <w:sz w:val="22"/>
+          <w:szCs w:val="22"/>
+        </w:rPr>
+        <w:t xml:space="preserve">•  The prompt engineering, system instruction design, and structured output schema used to generate personalised resilience action plans via large language model APIs.</w:t>
+      </w:r>
+    </w:p>
+    <w:p>
+      <w:pPr>
+        <w:spacing w:after="60" w:before="60"/>
+        <w:ind w:left="400"/>
+      </w:pPr>
+      <w:r>
+        <w:rPr>
+          <w:rFonts w:ascii="Calibri" w:cs="Calibri" w:eastAsia="Calibri" w:hAnsi="Calibri"/>
+          <w:sz w:val="22"/>
+          <w:szCs w:val="22"/>
+        </w:rPr>
+        <w:t xml:space="preserve">•  The logic for translating raw scores into prioritised, area-specific, household-contextualised checklists.</w:t>
+      </w:r>
+    </w:p>
+    <w:p>
+      <w:pPr>
+        <w:spacing w:after="60" w:before="60"/>
+        <w:ind w:left="400"/>
+      </w:pPr>
+      <w:r>
+        <w:rPr>
+          <w:rFonts w:ascii="Calibri" w:cs="Calibri" w:eastAsia="Calibri" w:hAnsi="Calibri"/>
+          <w:sz w:val="22"/>
+          <w:szCs w:val="22"/>
+        </w:rPr>
+        <w:t xml:space="preserve">•  The daily habits generation framework and its linkage to dimension scores and stated goals.</w:t>
       </w:r>
     </w:p>
     <w:p>
       <w:pPr>
         <w:pStyle w:val="Heading2"/>
-        <w:spacing w:after="120" w:before="240"/>
-      </w:pPr>
-      <w:r>
-        <w:t xml:space="preserve">3.4 Scenario Stress-Test Methodology</w:t>
-      </w:r>
-    </w:p>
-    <w:p>
-      <w:pPr>
-        <w:spacing w:after="60" w:before="60"/>
-        <w:ind w:left="360"/>
-      </w:pPr>
-      <w:r>
-        <w:rPr>
-          <w:rFonts w:ascii="Calibri" w:cs="Calibri" w:eastAsia="Calibri" w:hAnsi="Calibri"/>
-          <w:sz w:val="22"/>
-          <w:szCs w:val="22"/>
-        </w:rPr>
-        <w:t xml:space="preserve">• The AI-driven scenario simulation logic (e.g., 'sudden job loss', 'natural disaster', 'medical emergency') and how vulnerability gaps are identified from the user's existing resilience profile.</w:t>
-      </w:r>
-    </w:p>
-    <w:p>
-      <w:pPr>
-        <w:spacing w:after="60" w:before="60"/>
-        <w:ind w:left="360"/>
-      </w:pPr>
-      <w:r>
-        <w:rPr>
-          <w:rFonts w:ascii="Calibri" w:cs="Calibri" w:eastAsia="Calibri" w:hAnsi="Calibri"/>
-          <w:sz w:val="22"/>
-          <w:szCs w:val="22"/>
-        </w:rPr>
-        <w:t xml:space="preserve">• The structured scenario output format: impact analysis, immediate actions, recovery pathway.</w:t>
+        <w:spacing w:after="100" w:before="280"/>
+      </w:pPr>
+      <w:r>
+        <w:t xml:space="preserve">3.4  Scenario Stress-Test Methodology</w:t>
+      </w:r>
+    </w:p>
+    <w:p>
+      <w:pPr>
+        <w:spacing w:after="60" w:before="60"/>
+        <w:ind w:left="400"/>
+      </w:pPr>
+      <w:r>
+        <w:rPr>
+          <w:rFonts w:ascii="Calibri" w:cs="Calibri" w:eastAsia="Calibri" w:hAnsi="Calibri"/>
+          <w:sz w:val="22"/>
+          <w:szCs w:val="22"/>
+        </w:rPr>
+        <w:t xml:space="preserve">•  The AI-driven scenario simulation logic (e.g. ‘sudden job loss’, ‘natural disaster’, ‘medical emergency’) and how vulnerability gaps are identified from the user’s existing resilience profile.</w:t>
+      </w:r>
+    </w:p>
+    <w:p>
+      <w:pPr>
+        <w:spacing w:after="60" w:before="60"/>
+        <w:ind w:left="400"/>
+      </w:pPr>
+      <w:r>
+        <w:rPr>
+          <w:rFonts w:ascii="Calibri" w:cs="Calibri" w:eastAsia="Calibri" w:hAnsi="Calibri"/>
+          <w:sz w:val="22"/>
+          <w:szCs w:val="22"/>
+        </w:rPr>
+        <w:t xml:space="preserve">•  The structured scenario output format: impact analysis, immediate actions, recovery pathway.</w:t>
       </w:r>
     </w:p>
     <w:p>
       <w:pPr>
         <w:pStyle w:val="Heading2"/>
-        <w:spacing w:after="120" w:before="240"/>
-      </w:pPr>
-      <w:r>
-        <w:t xml:space="preserve">3.5 Checklist Framework &amp; Content</w:t>
-      </w:r>
-    </w:p>
-    <w:p>
-      <w:pPr>
-        <w:spacing w:after="60" w:before="60"/>
-        <w:ind w:left="360"/>
-      </w:pPr>
-      <w:r>
-        <w:rPr>
-          <w:rFonts w:ascii="Calibri" w:cs="Calibri" w:eastAsia="Calibri" w:hAnsi="Calibri"/>
-          <w:sz w:val="22"/>
-          <w:szCs w:val="22"/>
-        </w:rPr>
-        <w:t xml:space="preserve">• The curated checklist item library organized by resilience area, priority tier (Critical, High, Medium, Low), and household context.</w:t>
-      </w:r>
-    </w:p>
-    <w:p>
-      <w:pPr>
-        <w:spacing w:after="60" w:before="60"/>
-        <w:ind w:left="360"/>
-      </w:pPr>
-      <w:r>
-        <w:rPr>
-          <w:rFonts w:ascii="Calibri" w:cs="Calibri" w:eastAsia="Calibri" w:hAnsi="Calibri"/>
-          <w:sz w:val="22"/>
-          <w:szCs w:val="22"/>
-        </w:rPr>
-        <w:t xml:space="preserve">• The checklist item selection and ranking algorithm based on score gaps and stated goals.</w:t>
+        <w:spacing w:after="100" w:before="280"/>
+      </w:pPr>
+      <w:r>
+        <w:t xml:space="preserve">3.5  Checklist Framework &amp; Content</w:t>
+      </w:r>
+    </w:p>
+    <w:p>
+      <w:pPr>
+        <w:spacing w:after="60" w:before="60"/>
+        <w:ind w:left="400"/>
+      </w:pPr>
+      <w:r>
+        <w:rPr>
+          <w:rFonts w:ascii="Calibri" w:cs="Calibri" w:eastAsia="Calibri" w:hAnsi="Calibri"/>
+          <w:sz w:val="22"/>
+          <w:szCs w:val="22"/>
+        </w:rPr>
+        <w:t xml:space="preserve">•  The curated checklist item library organised by resilience area, priority tier (Critical, High, Medium, Low), and household context.</w:t>
+      </w:r>
+    </w:p>
+    <w:p>
+      <w:pPr>
+        <w:spacing w:after="60" w:before="60"/>
+        <w:ind w:left="400"/>
+      </w:pPr>
+      <w:r>
+        <w:rPr>
+          <w:rFonts w:ascii="Calibri" w:cs="Calibri" w:eastAsia="Calibri" w:hAnsi="Calibri"/>
+          <w:sz w:val="22"/>
+          <w:szCs w:val="22"/>
+        </w:rPr>
+        <w:t xml:space="preserve">•  The checklist item selection and ranking algorithm based on score gaps and stated goals.</w:t>
       </w:r>
     </w:p>
     <w:p>
       <w:pPr>
         <w:pStyle w:val="Heading2"/>
-        <w:spacing w:after="120" w:before="240"/>
-      </w:pPr>
-      <w:r>
-        <w:t xml:space="preserve">3.6 Brand &amp; Product Identity</w:t>
-      </w:r>
-    </w:p>
-    <w:p>
-      <w:pPr>
-        <w:spacing w:after="60" w:before="60"/>
-        <w:ind w:left="360"/>
-      </w:pPr>
-      <w:r>
-        <w:rPr>
-          <w:rFonts w:ascii="Calibri" w:cs="Calibri" w:eastAsia="Calibri" w:hAnsi="Calibri"/>
-          <w:sz w:val="22"/>
-          <w:szCs w:val="22"/>
-        </w:rPr>
-        <w:t xml:space="preserve">• The 'Resilium' brand name, logo, visual design language, and platform user interface.</w:t>
-      </w:r>
-    </w:p>
-    <w:p>
-      <w:pPr>
-        <w:spacing w:after="60" w:before="60"/>
-        <w:ind w:left="360"/>
-      </w:pPr>
-      <w:r>
-        <w:rPr>
-          <w:rFonts w:ascii="Calibri" w:cs="Calibri" w:eastAsia="Calibri" w:hAnsi="Calibri"/>
-          <w:sz w:val="22"/>
-          <w:szCs w:val="22"/>
-        </w:rPr>
-        <w:t xml:space="preserve">• The 'Know Your Readiness. Build Your Resilience.' tagline and associated marketing copy.</w:t>
-      </w:r>
-    </w:p>
-    <w:p>
-      <w:pPr>
-        <w:spacing w:after="60" w:before="60"/>
-        <w:ind w:left="360"/>
-      </w:pPr>
-      <w:r>
-        <w:rPr>
-          <w:rFonts w:ascii="Calibri" w:cs="Calibri" w:eastAsia="Calibri" w:hAnsi="Calibri"/>
-          <w:sz w:val="22"/>
-          <w:szCs w:val="22"/>
-        </w:rPr>
-        <w:t xml:space="preserve">• The Neural Canvas animated background and unique visual identity elements.</w:t>
+        <w:spacing w:after="100" w:before="280"/>
+      </w:pPr>
+      <w:r>
+        <w:t xml:space="preserve">3.6  Brand &amp; Product Identity</w:t>
+      </w:r>
+    </w:p>
+    <w:p>
+      <w:pPr>
+        <w:spacing w:after="60" w:before="60"/>
+        <w:ind w:left="400"/>
+      </w:pPr>
+      <w:r>
+        <w:rPr>
+          <w:rFonts w:ascii="Calibri" w:cs="Calibri" w:eastAsia="Calibri" w:hAnsi="Calibri"/>
+          <w:sz w:val="22"/>
+          <w:szCs w:val="22"/>
+        </w:rPr>
+        <w:t xml:space="preserve">•  The ‘Resilium’ brand name, logo, visual design language, and platform user interface.</w:t>
+      </w:r>
+    </w:p>
+    <w:p>
+      <w:pPr>
+        <w:spacing w:after="60" w:before="60"/>
+        <w:ind w:left="400"/>
+      </w:pPr>
+      <w:r>
+        <w:rPr>
+          <w:rFonts w:ascii="Calibri" w:cs="Calibri" w:eastAsia="Calibri" w:hAnsi="Calibri"/>
+          <w:sz w:val="22"/>
+          <w:szCs w:val="22"/>
+        </w:rPr>
+        <w:t xml:space="preserve">•  The ‘Know Your Readiness. Build Your Resilience.’ tagline and associated marketing copy.</w:t>
+      </w:r>
+    </w:p>
+    <w:p>
+      <w:pPr>
+        <w:spacing w:after="60" w:before="60"/>
+        <w:ind w:left="400"/>
+      </w:pPr>
+      <w:r>
+        <w:rPr>
+          <w:rFonts w:ascii="Calibri" w:cs="Calibri" w:eastAsia="Calibri" w:hAnsi="Calibri"/>
+          <w:sz w:val="22"/>
+          <w:szCs w:val="22"/>
+        </w:rPr>
+        <w:t xml:space="preserve">•  The Neural Canvas animated background and unique visual identity elements.</w:t>
       </w:r>
     </w:p>
     <w:p>
       <w:pPr>
         <w:pStyle w:val="Heading1"/>
-        <w:spacing w:after="120" w:before="240"/>
+        <w:spacing w:after="100" w:before="280"/>
       </w:pPr>
       <w:r>
         <w:t xml:space="preserve">4. Confidentiality Obligations</w:t>
@@ -454,7 +459,7 @@
           <w:sz w:val="22"/>
           <w:szCs w:val="22"/>
         </w:rPr>
-        <w:t xml:space="preserve">All employees, contractors, advisors, and third parties who have access to any of the proprietary assets described in Section 3 are bound by confidentiality obligations. Unauthorized disclosure, reproduction, reverse engineering, or use of these trade secrets for competitive purposes constitutes a violation of applicable trade secret law and unfair competition regulations.</w:t>
+        <w:t xml:space="preserve">All employees, contractors, advisors, and third parties who have access to any of the proprietary assets described in Section 3 are bound by confidentiality obligations. Unauthorised disclosure, reproduction, reverse engineering, or use of these trade secrets for competitive purposes constitutes a violation of applicable trade secret law and unfair competition regulations.</w:t>
       </w:r>
     </w:p>
     <w:p>
@@ -468,13 +473,13 @@
           <w:sz w:val="22"/>
           <w:szCs w:val="22"/>
         </w:rPr>
-        <w:t xml:space="preserve">Access to these assets must be granted on a strict need-to-know basis and must be revoked immediately upon termination of any professional relationship with the operator.</w:t>
+        <w:t xml:space="preserve">Access must be granted on a strict need-to-know basis and revoked immediately upon termination of any professional relationship with the operator.</w:t>
       </w:r>
     </w:p>
     <w:p>
       <w:pPr>
         <w:pStyle w:val="Heading1"/>
-        <w:spacing w:after="120" w:before="240"/>
+        <w:spacing w:after="100" w:before="280"/>
       </w:pPr>
       <w:r>
         <w:t xml:space="preserve">5. Notice of Rights</w:t>
@@ -511,63 +516,63 @@
     <w:p>
       <w:pPr>
         <w:spacing w:after="60" w:before="60"/>
-        <w:ind w:left="360"/>
-      </w:pPr>
-      <w:r>
-        <w:rPr>
-          <w:rFonts w:ascii="Calibri" w:cs="Calibri" w:eastAsia="Calibri" w:hAnsi="Calibri"/>
-          <w:sz w:val="22"/>
-          <w:szCs w:val="22"/>
-        </w:rPr>
-        <w:t xml:space="preserve">• Romanian Law no. 8/1996 on copyright and related rights</w:t>
-      </w:r>
-    </w:p>
-    <w:p>
-      <w:pPr>
-        <w:spacing w:after="60" w:before="60"/>
-        <w:ind w:left="360"/>
-      </w:pPr>
-      <w:r>
-        <w:rPr>
-          <w:rFonts w:ascii="Calibri" w:cs="Calibri" w:eastAsia="Calibri" w:hAnsi="Calibri"/>
-          <w:sz w:val="22"/>
-          <w:szCs w:val="22"/>
-        </w:rPr>
-        <w:t xml:space="preserve">• EU Trade Secrets Directive (2016/943/EU), transposed into Romanian law via Law no. 11/1991</w:t>
-      </w:r>
-    </w:p>
-    <w:p>
-      <w:pPr>
-        <w:spacing w:after="60" w:before="60"/>
-        <w:ind w:left="360"/>
-      </w:pPr>
-      <w:r>
-        <w:rPr>
-          <w:rFonts w:ascii="Calibri" w:cs="Calibri" w:eastAsia="Calibri" w:hAnsi="Calibri"/>
-          <w:sz w:val="22"/>
-          <w:szCs w:val="22"/>
-        </w:rPr>
-        <w:t xml:space="preserve">• US Defend Trade Secrets Act (DTSA), 18 U.S.C. § 1836 et seq.</w:t>
-      </w:r>
-    </w:p>
-    <w:p>
-      <w:pPr>
-        <w:spacing w:after="60" w:before="60"/>
-        <w:ind w:left="360"/>
-      </w:pPr>
-      <w:r>
-        <w:rPr>
-          <w:rFonts w:ascii="Calibri" w:cs="Calibri" w:eastAsia="Calibri" w:hAnsi="Calibri"/>
-          <w:sz w:val="22"/>
-          <w:szCs w:val="22"/>
-        </w:rPr>
-        <w:t xml:space="preserve">• EU Database Directive (96/9/EC) — the checklist and methodology database qualifies for sui generis database rights</w:t>
+        <w:ind w:left="400"/>
+      </w:pPr>
+      <w:r>
+        <w:rPr>
+          <w:rFonts w:ascii="Calibri" w:cs="Calibri" w:eastAsia="Calibri" w:hAnsi="Calibri"/>
+          <w:sz w:val="22"/>
+          <w:szCs w:val="22"/>
+        </w:rPr>
+        <w:t xml:space="preserve">•  Romanian Law no. 8/1996 on copyright and related rights</w:t>
+      </w:r>
+    </w:p>
+    <w:p>
+      <w:pPr>
+        <w:spacing w:after="60" w:before="60"/>
+        <w:ind w:left="400"/>
+      </w:pPr>
+      <w:r>
+        <w:rPr>
+          <w:rFonts w:ascii="Calibri" w:cs="Calibri" w:eastAsia="Calibri" w:hAnsi="Calibri"/>
+          <w:sz w:val="22"/>
+          <w:szCs w:val="22"/>
+        </w:rPr>
+        <w:t xml:space="preserve">•  EU Trade Secrets Directive (2016/943/EU), transposed into Romanian law via Law no. 11/1991</w:t>
+      </w:r>
+    </w:p>
+    <w:p>
+      <w:pPr>
+        <w:spacing w:after="60" w:before="60"/>
+        <w:ind w:left="400"/>
+      </w:pPr>
+      <w:r>
+        <w:rPr>
+          <w:rFonts w:ascii="Calibri" w:cs="Calibri" w:eastAsia="Calibri" w:hAnsi="Calibri"/>
+          <w:sz w:val="22"/>
+          <w:szCs w:val="22"/>
+        </w:rPr>
+        <w:t xml:space="preserve">•  US Defend Trade Secrets Act (DTSA), 18 U.S.C. § 1836 et seq.</w:t>
+      </w:r>
+    </w:p>
+    <w:p>
+      <w:pPr>
+        <w:spacing w:after="60" w:before="60"/>
+        <w:ind w:left="400"/>
+      </w:pPr>
+      <w:r>
+        <w:rPr>
+          <w:rFonts w:ascii="Calibri" w:cs="Calibri" w:eastAsia="Calibri" w:hAnsi="Calibri"/>
+          <w:sz w:val="22"/>
+          <w:szCs w:val="22"/>
+        </w:rPr>
+        <w:t xml:space="preserve">•  EU Database Directive (96/9/EC) — the checklist and methodology database qualifies for sui generis database rights</w:t>
       </w:r>
     </w:p>
     <w:p>
       <w:pPr>
         <w:pStyle w:val="Heading1"/>
-        <w:spacing w:after="120" w:before="240"/>
+        <w:spacing w:after="100" w:before="280"/>
       </w:pPr>
       <w:r>
         <w:t xml:space="preserve">6. Document Control</w:t>
@@ -584,7 +589,7 @@
           <w:sz w:val="22"/>
           <w:szCs w:val="22"/>
         </w:rPr>
-        <w:t xml:space="preserve">This document should be reviewed and updated annually or whenever a material change is made to the methodology or technology. Copies should be stored securely and not distributed outside the organization without legal counsel review.</w:t>
+        <w:t xml:space="preserve">This document should be reviewed and updated annually or whenever a material change is made to the methodology or technology. Copies should be stored securely and not distributed outside the organisation without legal counsel review.</w:t>
       </w:r>
     </w:p>
     <w:p>
@@ -606,12 +611,12 @@
         <w:pBdr>
           <w:bottom w:val="single" w:color="D97706" w:sz="6"/>
         </w:pBdr>
-        <w:spacing w:after="120" w:before="120"/>
-      </w:pPr>
-    </w:p>
-    <w:p>
-      <w:pPr>
-        <w:spacing w:before="160"/>
+        <w:spacing w:after="160" w:before="160"/>
+      </w:pPr>
+    </w:p>
+    <w:p>
+      <w:pPr>
+        <w:spacing w:after="60" w:before="60"/>
         <w:jc w:val="center"/>
       </w:pPr>
       <w:r>
@@ -812,13 +817,7 @@
 <file path=word/styles.xml><?xml version="1.0" encoding="utf-8"?>
 <w:styles xmlns:mc="http://schemas.openxmlformats.org/markup-compatibility/2006" xmlns:r="http://schemas.openxmlformats.org/officeDocument/2006/relationships" xmlns:w="http://schemas.openxmlformats.org/wordprocessingml/2006/main" xmlns:w14="http://schemas.microsoft.com/office/word/2010/wordml" xmlns:w15="http://schemas.microsoft.com/office/word/2012/wordml" mc:Ignorable="w14 w15">
   <w:docDefaults>
-    <w:rPrDefault>
-      <w:rPr>
-        <w:rFonts w:ascii="Calibri" w:cs="Calibri" w:eastAsia="Calibri" w:hAnsi="Calibri"/>
-        <w:sz w:val="22"/>
-        <w:szCs w:val="22"/>
-      </w:rPr>
-    </w:rPrDefault>
+    <w:rPrDefault/>
     <w:pPrDefault/>
   </w:docDefaults>
   <w:style w:type="paragraph" w:styleId="Title">

</xml_diff>